<commit_message>
Added VxKex 1.2.0.2222 original source code
</commit_message>
<xml_diff>
--- a/00-Documentation/VxKex Registry Keys.docx
+++ b/00-Documentation/VxKex Registry Keys.docx
@@ -19,7 +19,19 @@
         <w:t xml:space="preserve">are considered owned by VxKex, and their values and subkeys </w:t>
       </w:r>
       <w:r>
-        <w:t>may be deleted or changed without consideration for the system or other applications. Such keys must be deleted when VxKex is uninstalled.</w:t>
+        <w:t xml:space="preserve">may be deleted or changed without consideration for the system or other applications. Such keys </w:t>
+      </w:r>
+      <w:r>
+        <w:t>may</w:t>
+      </w:r>
+      <w:r>
+        <w:t xml:space="preserve"> be </w:t>
+      </w:r>
+      <w:r>
+        <w:t xml:space="preserve">safely </w:t>
+      </w:r>
+      <w:r>
+        <w:t>deleted when VxKex is uninstalled.</w:t>
       </w:r>
     </w:p>
     <w:p>
@@ -687,7 +699,10 @@
         <w:rPr>
           <w:u w:val="single"/>
         </w:rPr>
-        <w:t xml:space="preserve">KEX_DisableAppSpecific </w:t>
+        <w:t>KEX_DisableAppSpecific</w:t>
+      </w:r>
+      <w:r>
+        <w:t xml:space="preserve"> </w:t>
       </w:r>
       <w:r>
         <w:t>(</w:t>
@@ -720,7 +735,10 @@
         <w:rPr>
           <w:u w:val="single"/>
         </w:rPr>
-        <w:t xml:space="preserve">KEX_WinVerSpoof </w:t>
+        <w:t>KEX_WinVerSpoof</w:t>
+      </w:r>
+      <w:r>
+        <w:t xml:space="preserve"> </w:t>
       </w:r>
       <w:r>
         <w:t>(</w:t>
@@ -747,7 +765,10 @@
         <w:ind w:left="2160"/>
       </w:pPr>
       <w:r>
-        <w:t>See the KEX_WIN_VER_SPOOF enumeration for valid values of this key.</w:t>
+        <w:t>See the KEX_WIN_VER_SPOOF enumerati</w:t>
+      </w:r>
+      <w:r>
+        <w:t>on for valid values of this key.</w:t>
       </w:r>
     </w:p>
     <w:p>
@@ -762,7 +783,10 @@
         <w:rPr>
           <w:u w:val="single"/>
         </w:rPr>
-        <w:t xml:space="preserve">KEX_StrongVersionSpoof </w:t>
+        <w:t>KEX_StrongVersionSpoof</w:t>
+      </w:r>
+      <w:r>
+        <w:t xml:space="preserve"> </w:t>
       </w:r>
       <w:r>
         <w:t>(</w:t>
@@ -782,20 +806,328 @@
       <w:r>
         <w:t>This value is a bit-field containing additional options for the version spoofer.</w:t>
       </w:r>
-    </w:p>
-    <w:p>
-      <w:pPr>
-        <w:pStyle w:val="ListParagraph"/>
-        <w:ind w:left="2160"/>
-        <w:rPr>
-          <w:b/>
-        </w:rPr>
-      </w:pPr>
+      <w:r>
+        <w:br/>
+      </w:r>
       <w:r>
         <w:t>See the KEX_STRONGSPOOF_* definitions and verspoof.c for more information.</w:t>
+      </w:r>
+    </w:p>
+    <w:p>
+      <w:pPr>
+        <w:pStyle w:val="ListParagraph"/>
+        <w:numPr>
+          <w:ilvl w:val="2"/>
+          <w:numId w:val="3"/>
+        </w:numPr>
+      </w:pPr>
+      <w:r>
+        <w:rPr>
+          <w:u w:val="single"/>
+        </w:rPr>
+        <w:t>KEX_DisableConsoleEnhancements</w:t>
+      </w:r>
+      <w:r>
+        <w:t xml:space="preserve"> (</w:t>
+      </w:r>
+      <w:r>
+        <w:rPr>
+          <w:i/>
+        </w:rPr>
+        <w:t>REG_DWORD</w:t>
+      </w:r>
+      <w:r>
+        <w:t>)</w:t>
+      </w:r>
+      <w:r>
+        <w:br/>
+        <w:t>Controls support for console enhancements. This value is currently a Boolean which, if set to a non-zero value, disables support for ANSI escape sequences; however, if more console enhancements are added in the future, this value may be converted to a bitfield.</w:t>
+      </w:r>
+    </w:p>
+    <w:p>
+      <w:pPr>
+        <w:pStyle w:val="ListParagraph"/>
+        <w:numPr>
+          <w:ilvl w:val="2"/>
+          <w:numId w:val="3"/>
+        </w:numPr>
+      </w:pPr>
+      <w:r>
+        <w:rPr>
+          <w:u w:val="single"/>
+        </w:rPr>
+        <w:t>KEX_TlsForceEnabledProtocols</w:t>
+      </w:r>
+      <w:r>
+        <w:t xml:space="preserve"> (</w:t>
+      </w:r>
+      <w:r>
+        <w:rPr>
+          <w:i/>
+        </w:rPr>
+        <w:t>REG_DWORD</w:t>
+      </w:r>
+      <w:r>
+        <w:t>)</w:t>
+      </w:r>
+      <w:r>
+        <w:br/>
+        <w:t>Forcibly enables TLS protocol versions in KxSChanl. This is a bitmask of SP_PROT_* values.</w:t>
+      </w:r>
+    </w:p>
+    <w:p>
+      <w:pPr>
+        <w:pStyle w:val="ListParagraph"/>
+        <w:numPr>
+          <w:ilvl w:val="2"/>
+          <w:numId w:val="3"/>
+        </w:numPr>
+      </w:pPr>
+      <w:r>
+        <w:rPr>
+          <w:u w:val="single"/>
+        </w:rPr>
+        <w:t>KEX_TlsForceDisabledProtocols</w:t>
+      </w:r>
+      <w:r>
+        <w:t xml:space="preserve"> (</w:t>
+      </w:r>
+      <w:r>
+        <w:rPr>
+          <w:i/>
+        </w:rPr>
+        <w:t>REG_DWORD</w:t>
+      </w:r>
+      <w:r>
+        <w:t>)</w:t>
+      </w:r>
+      <w:r>
+        <w:br/>
+        <w:t>Forcibly disables TLS protocol versions in KxSChanl. This is a bitmask of SP_PROT_* values.</w:t>
+      </w:r>
+      <w:r>
+        <w:br/>
+        <w:t>If bits in TlsForceDisabledProtocols conflict with bits set in TlsForceEnabledProtocols, the force-disabled protocols will have priority.</w:t>
+      </w:r>
+      <w:r>
+        <w:br/>
+        <w:t>If all KxSchanl-supported protocols are forcibly disabled, KxSChanl will be disabled, and the system Schannel will be used instead. In order to deliberately achieve this effect, set KEX_TlsForceDisabledProtocols to 0xFFFFFFFF.</w:t>
+      </w:r>
+    </w:p>
+    <w:p>
+      <w:pPr>
+        <w:pStyle w:val="ListParagraph"/>
+        <w:numPr>
+          <w:ilvl w:val="2"/>
+          <w:numId w:val="3"/>
+        </w:numPr>
+      </w:pPr>
+      <w:r>
+        <w:rPr>
+          <w:u w:val="single"/>
+        </w:rPr>
+        <w:t>KEX_DllRewriteEntries</w:t>
+      </w:r>
+      <w:r>
+        <w:t xml:space="preserve"> (</w:t>
+      </w:r>
+      <w:r>
+        <w:rPr>
+          <w:i/>
+        </w:rPr>
+        <w:t>REG_SZ</w:t>
+      </w:r>
+      <w:r>
+        <w:t>)</w:t>
+      </w:r>
+      <w:r>
+        <w:br/>
+      </w:r>
+      <w:r>
+        <w:t xml:space="preserve">A bar-separated list of key-value pairs, where keys and values are separated by colons. Entries in this list </w:t>
+      </w:r>
+      <w:r>
+        <w:t>will update the DLL rewrite mapper</w:t>
+      </w:r>
+      <w:r>
+        <w:t xml:space="preserve"> before any imports are loaded</w:t>
+      </w:r>
+      <w:r>
+        <w:t>. A key-value pair where the value is empty will cause the DLL rewrite entry in question to be deleted.</w:t>
+      </w:r>
+      <w:r>
+        <w:br/>
+      </w:r>
+      <w:r>
+        <w:t>Example:</w:t>
+      </w:r>
+      <w:r>
+        <w:t xml:space="preserve"> </w:t>
+      </w:r>
+      <w:r>
+        <w:t xml:space="preserve"> </w:t>
+      </w:r>
+      <w:r>
+        <w:rPr>
+          <w:rFonts w:ascii="Consolas" w:hAnsi="Consolas" w:cs="Consolas"/>
+          <w:sz w:val="18"/>
+          <w:szCs w:val="18"/>
+          <w:highlight w:val="green"/>
+        </w:rPr>
+        <w:t>d3d12:dxvk|</w:t>
+      </w:r>
+      <w:r>
+        <w:rPr>
+          <w:rFonts w:ascii="Consolas" w:hAnsi="Consolas" w:cs="Consolas"/>
+          <w:sz w:val="18"/>
+          <w:szCs w:val="18"/>
+          <w:highlight w:val="green"/>
+        </w:rPr>
+        <w:t>dxgi:</w:t>
+      </w:r>
+      <w:r>
+        <w:rPr>
+          <w:rFonts w:ascii="Consolas" w:hAnsi="Consolas" w:cs="Consolas"/>
+          <w:sz w:val="18"/>
+          <w:szCs w:val="18"/>
+          <w:highlight w:val="green"/>
+        </w:rPr>
+        <w:t>|</w:t>
+      </w:r>
+      <w:r>
+        <w:rPr>
+          <w:rFonts w:ascii="Consolas" w:hAnsi="Consolas" w:cs="Consolas"/>
+          <w:sz w:val="18"/>
+          <w:szCs w:val="18"/>
+          <w:highlight w:val="green"/>
+        </w:rPr>
+        <w:t>xinput1_5:xinput1_3</w:t>
+      </w:r>
+      <w:r>
+        <w:t xml:space="preserve"> </w:t>
+      </w:r>
+      <w:r>
+        <w:t xml:space="preserve"> </w:t>
+      </w:r>
+      <w:r>
+        <w:t>(DXGI.dll would be removed from the rewrite list).</w:t>
+      </w:r>
+      <w:r>
+        <w:br/>
+        <w:t>None of the DLL names specified should have a .dll extension.</w:t>
+      </w:r>
+      <w:r>
+        <w:br/>
+        <w:t xml:space="preserve">All of the rewritten DLL names specified </w:t>
+      </w:r>
+      <w:r>
+        <w:rPr>
+          <w:b/>
+        </w:rPr>
+        <w:t>must be shorter or same length</w:t>
+      </w:r>
+      <w:r>
+        <w:t xml:space="preserve"> compared to the original names.</w:t>
+      </w:r>
+      <w:r>
+        <w:br/>
+        <w:t>The total length of the</w:t>
+      </w:r>
+      <w:r>
+        <w:t xml:space="preserve"> registry value</w:t>
+      </w:r>
+      <w:r>
+        <w:t xml:space="preserve"> str</w:t>
       </w:r>
       <w:bookmarkStart w:id="0" w:name="_GoBack"/>
       <w:bookmarkEnd w:id="0"/>
+      <w:r>
+        <w:t xml:space="preserve">ing </w:t>
+      </w:r>
+      <w:r>
+        <w:t>must</w:t>
+      </w:r>
+      <w:r>
+        <w:t xml:space="preserve"> not exceed 259 characters.</w:t>
+      </w:r>
+    </w:p>
+    <w:p>
+      <w:pPr>
+        <w:pStyle w:val="ListParagraph"/>
+        <w:numPr>
+          <w:ilvl w:val="2"/>
+          <w:numId w:val="3"/>
+        </w:numPr>
+      </w:pPr>
+      <w:r>
+        <w:rPr>
+          <w:u w:val="single"/>
+        </w:rPr>
+        <w:t>KEX_DllRewriteExemptions</w:t>
+      </w:r>
+      <w:r>
+        <w:t xml:space="preserve"> (</w:t>
+      </w:r>
+      <w:r>
+        <w:rPr>
+          <w:i/>
+        </w:rPr>
+        <w:t>REG_SZ</w:t>
+      </w:r>
+      <w:r>
+        <w:t>)</w:t>
+      </w:r>
+      <w:r>
+        <w:br/>
+        <w:t>A bar-separated list of DLL names which will not have their import tables rewritten.</w:t>
+      </w:r>
+      <w:r>
+        <w:br/>
+        <w:t xml:space="preserve">Example: </w:t>
+      </w:r>
+      <w:r>
+        <w:rPr>
+          <w:rFonts w:ascii="Consolas" w:hAnsi="Consolas" w:cs="Consolas"/>
+          <w:sz w:val="18"/>
+          <w:szCs w:val="18"/>
+          <w:highlight w:val="green"/>
+        </w:rPr>
+        <w:t>steam_api64.dll|MacType64.Core.dll|RTSSHooks64.dll</w:t>
+      </w:r>
+      <w:r>
+        <w:br/>
+        <w:t xml:space="preserve">Unlike KEX_DllRewriteEntries, all DLL names specified </w:t>
+      </w:r>
+      <w:r>
+        <w:rPr>
+          <w:b/>
+        </w:rPr>
+        <w:t>should</w:t>
+      </w:r>
+      <w:r>
+        <w:t xml:space="preserve"> have a file extension (e.g. .dll, .pyd).</w:t>
+      </w:r>
+      <w:r>
+        <w:br/>
+      </w:r>
+      <w:r>
+        <w:t>The total length of the</w:t>
+      </w:r>
+      <w:r>
+        <w:t xml:space="preserve"> </w:t>
+      </w:r>
+      <w:r>
+        <w:t>registry value</w:t>
+      </w:r>
+      <w:r>
+        <w:t xml:space="preserve"> string </w:t>
+      </w:r>
+      <w:r>
+        <w:t>must</w:t>
+      </w:r>
+      <w:r>
+        <w:t xml:space="preserve"> not exceed 259 characters.</w:t>
+      </w:r>
     </w:p>
     <w:p>
       <w:pPr>
@@ -879,6 +1211,7 @@
         <w:rPr>
           <w:u w:val="single"/>
         </w:rPr>
+        <w:lastRenderedPageBreak/>
         <w:t>(</w:t>
       </w:r>
       <w:r>
@@ -1029,7 +1362,7 @@
   <w:abstractNum w:abstractNumId="0">
     <w:nsid w:val="2BFF1D1D"/>
     <w:multiLevelType w:val="hybridMultilevel"/>
-    <w:tmpl w:val="979E36CA"/>
+    <w:tmpl w:val="E02A6370"/>
     <w:lvl w:ilvl="0" w:tplc="0C090001">
       <w:start w:val="1"/>
       <w:numFmt w:val="bullet"/>
@@ -1680,7 +2013,6 @@
   <w:style w:type="character" w:default="1" w:styleId="DefaultParagraphFont">
     <w:name w:val="Default Paragraph Font"/>
     <w:uiPriority w:val="1"/>
-    <w:semiHidden/>
     <w:unhideWhenUsed/>
   </w:style>
   <w:style w:type="table" w:default="1" w:styleId="TableNormal">
@@ -1920,7 +2252,6 @@
   <w:style w:type="character" w:default="1" w:styleId="DefaultParagraphFont">
     <w:name w:val="Default Paragraph Font"/>
     <w:uiPriority w:val="1"/>
-    <w:semiHidden/>
     <w:unhideWhenUsed/>
   </w:style>
   <w:style w:type="table" w:default="1" w:styleId="TableNormal">
@@ -2263,7 +2594,7 @@
 </file>
 
 <file path=customXml/itemProps1.xml><?xml version="1.0" encoding="utf-8"?>
-<ds:datastoreItem xmlns:ds="http://schemas.openxmlformats.org/officeDocument/2006/customXml" ds:itemID="{ACCA0FEA-DECD-42A1-9E9F-36337B70B9C9}">
+<ds:datastoreItem xmlns:ds="http://schemas.openxmlformats.org/officeDocument/2006/customXml" ds:itemID="{240BB03F-E298-417D-A4A4-22321DE4CA40}">
   <ds:schemaRefs>
     <ds:schemaRef ds:uri="http://schemas.openxmlformats.org/officeDocument/2006/bibliography"/>
   </ds:schemaRefs>

</xml_diff>